<commit_message>
paper: rename shorthand S25 -> Sha26 (paper is a 2026 publication)
The reference is Sharma et al. 2026 (ApJS, 283, 30) but the shorthand read S25 —
wrong year, and a bare single letter is unconventional. Use Sha26 throughout
(defined at first use as 'Sharma et al. (2026, hereafter Sha26)'). Regenerated docx.

Co-Authored-By: Claude Opus 4.8 (1M context) <noreply@anthropic.com>
</commit_message>
<xml_diff>
--- a/docs/paper/Circex_paper.docx
+++ b/docs/paper/Circex_paper.docx
@@ -108,7 +108,7 @@
         <w:rPr>
           <w:sz w:val="18"/>
         </w:rPr>
-        <w:t>The General Coordinates Network (GCN) Circulars are human-written reports of time-domain and multimessenger observations; the archive of more than 40,500 prose Circulars is difficult to ingest into structured downstream systems. Building directly on the LLM-based analysis of the Circulars archive by Sharma et al. (2026, hereafter S25) — whose released topic labels, archive, and Swift-validated redshift table we adopt — we present Circex, a pipeline that converts optical Circulars into validated JSON conforming to a single output schema (nasa-gcn/gcn-schema). Extractors sharing that schema are compared on 500 rows of the S25 gold set: a transparent regular-expression baseline, and the same Mistral-7B-Instruct-v0.2 model used by S25, served locally with grammar-constrained decoding so the sampler cannot emit a token that violates the schema. The constrained model attains F1 = 0.935 on redshift extraction, against 0.690 for the identical model under free-form generation (Δ = +0.245) and 0.862 for the regex baseline. The improvement is confined to recall (0.559 → 0.937) at comparable precision (0.903 → 0.932): under free-form generation the model fails to emit parseable output that is then discarded, rather than extracting incorrectly. We conclude that the apparent weakness of open 7B models on this task is substantially an artifact of the output serialization rather than of the model, and that constrained decoding recovers extraction ability with no fine-tuning, retrieval, or larger model. The converse is also reported: on lexically regular event names the regex baseline (0.869) exceeds both language-model configurations, so the strongest system is a hybrid that routes each field to the extractor whose failure mode it can tolerate. We describe a live ingestion path that posts extracted photometry into SkyPortal in real time and release the pipeline as an installable package.</w:t>
+        <w:t>The General Coordinates Network (GCN) Circulars are human-written reports of time-domain and multimessenger observations; the archive of more than 40,500 prose Circulars is difficult to ingest into structured downstream systems. Building directly on the LLM-based analysis of the Circulars archive by Sharma et al. (2026, hereafter Sha26) — whose released topic labels, archive, and Swift-validated redshift table we adopt — we present Circex, a pipeline that converts optical Circulars into validated JSON conforming to a single output schema (nasa-gcn/gcn-schema). Extractors sharing that schema are compared on 500 rows of the Sha26 gold set: a transparent regular-expression baseline, and the same Mistral-7B-Instruct-v0.2 model used by Sha26, served locally with grammar-constrained decoding so the sampler cannot emit a token that violates the schema. The constrained model attains F1 = 0.935 on redshift extraction, against 0.690 for the identical model under free-form generation (Δ = +0.245) and 0.862 for the regex baseline. The improvement is confined to recall (0.559 → 0.937) at comparable precision (0.903 → 0.932): under free-form generation the model fails to emit parseable output that is then discarded, rather than extracting incorrectly. We conclude that the apparent weakness of open 7B models on this task is substantially an artifact of the output serialization rather than of the model, and that constrained decoding recovers extraction ability with no fine-tuning, retrieval, or larger model. The converse is also reported: on lexically regular event names the regex baseline (0.869) exceeds both language-model configurations, so the strongest system is a hybrid that routes each field to the extractor whose failure mode it can tolerate. We describe a live ingestion path that posts extracted photometry into SkyPortal in real time and release the pipeline as an installable package.</w:t>
       </w:r>
     </w:p>
     <w:p>
@@ -173,7 +173,7 @@
           <w:i w:val="0"/>
           <w:sz w:val="19"/>
         </w:rPr>
-        <w:t>S25 established the modern treatment of this archive with large language models, contributing a neural topic-modeling pipeline, a contrastively fine-tuned classifier of observation wave bands, and a Mistral-based system for extracting gamma-ray burst redshifts, reporting 97.2% accuracy on redshift-containing Circulars retrieved by retrieval-augmented generation. We build directly on that work.</w:t>
+        <w:t>Sha26 established the modern treatment of this archive with large language models, contributing a neural topic-modeling pipeline, a contrastively fine-tuned classifier of observation wave bands, and a Mistral-based system for extracting gamma-ray burst redshifts, reporting 97.2% accuracy on redshift-containing Circulars retrieved by retrieval-augmented generation. We build directly on that work.</w:t>
       </w:r>
       <w:r>
         <w:rPr>
@@ -194,7 +194,7 @@
           <w:i w:val="0"/>
           <w:sz w:val="19"/>
         </w:rPr>
-        <w:t>The present paper isolates a single design variable that S25 did not vary: the channel through which the language model’s output is obtained. Where S25 generate free-form text and parse it after the fact, we serve the identical model with grammar-constrained decoding, in which the sampler is masked at every step to tokens that continue a schema-valid string. Because the model is held fixed, the comparison measures the extraction harness rather than model capability. Two further contributions accompany this result: a transparent regular-expression baseline that establishes a floor on every field, and a live path that posts extracted photometry into SkyPortal as Circulars arrive.</w:t>
+        <w:t>The present paper isolates a single design variable that Sha26 did not vary: the channel through which the language model’s output is obtained. Where Sha26 generate free-form text and parse it after the fact, we serve the identical model with grammar-constrained decoding, in which the sampler is masked at every step to tokens that continue a schema-valid string. Because the model is held fixed, the comparison measures the extraction harness rather than model capability. Two further contributions accompany this result: a transparent regular-expression baseline that establishes a floor on every field, and a live path that posts extracted photometry into SkyPortal as Circulars arrive.</w:t>
       </w:r>
     </w:p>
     <w:p>
@@ -284,7 +284,7 @@
           <w:i w:val="0"/>
           <w:sz w:val="19"/>
         </w:rPr>
-        <w:t>2.1.3. Evaluation. — We score against the first 500 rows of the 13,593-row Swift-validated redshift table released by S25, using a null-aware comparator with per-field precision, recall, and F1. Numeric fields use tolerances; list fields use greedy matching. Both our extractors and the S25 predictions are scored against the same Actual columns, so all denominators are identical.</w:t>
+        <w:t>2.1.3. Evaluation. — We score against the first 500 rows of the 13,593-row Swift-validated redshift table released by Sha26, using a null-aware comparator with per-field precision, recall, and F1. Numeric fields use tolerances; list fields use greedy matching. Both our extractors and the Sha26 predictions are scored against the same Actual columns, so all denominators are identical.</w:t>
       </w:r>
     </w:p>
     <w:p>
@@ -311,7 +311,7 @@
           <w:i w:val="0"/>
           <w:sz w:val="19"/>
         </w:rPr>
-        <w:t>On the three fields with non-zero gold support (Table 1), the regex baseline reaches F1 = 0.869 on event names and 0.862 on redshift, exceeding the published Mistral predictions by +0.020 and +0.171 respectively. That a transparent baseline already matches a language model on these fields is not a criticism of S25 but a calibration: it establishes the floor above which the constrained-decoding gain of Section 3 is measured.</w:t>
+        <w:t>On the three fields with non-zero gold support (Table 1), the regex baseline reaches F1 = 0.869 on event names and 0.862 on redshift, exceeding the published Mistral predictions by +0.020 and +0.171 respectively. That a transparent baseline already matches a language model on these fields is not a criticism of Sha26 but a calibration: it establishes the floor above which the constrained-decoding gain of Section 3 is measured.</w:t>
       </w:r>
     </w:p>
     <w:p>
@@ -350,7 +350,7 @@
           <w:i/>
           <w:sz w:val="17"/>
         </w:rPr>
-        <w:t>Per-field F1 on 500 rows of the S25 Swift-validated gold set. Support is the number of non-null gold values (TP + FN). The regex baseline does not attempt telescope-name extraction.</w:t>
+        <w:t>Per-field F1 on 500 rows of the Sha26 Swift-validated gold set. Support is the number of non-null gold values (TP + FN). The regex baseline does not attempt telescope-name extraction.</w:t>
       </w:r>
     </w:p>
     <w:tbl>
@@ -449,7 +449,7 @@
                 <w:b/>
                 <w:sz w:val="17"/>
               </w:rPr>
-              <w:t>Mistral-7B (S25)</w:t>
+              <w:t>Mistral-7B (Sha26)</w:t>
             </w:r>
           </w:p>
         </w:tc>
@@ -750,7 +750,7 @@
           <w:i w:val="0"/>
           <w:sz w:val="19"/>
         </w:rPr>
-        <w:t>3.1.1. Model and serving. — We use the same Mistral-7B-Instruct-v0.2 model as S25 (Jiang et al. 2023), served locally through a llama.cpp server exposing an OpenAI-compatible interface on a single GPU. The prompt — an extraction policy and few-shot examples — is shared across all backends; only the output channel varies.</w:t>
+        <w:t>3.1.1. Model and serving. — We use the same Mistral-7B-Instruct-v0.2 model as Sha26 (Jiang et al. 2023), served locally through a llama.cpp server exposing an OpenAI-compatible interface on a single GPU. The prompt — an extraction policy and few-shot examples — is shared across all backends; only the output channel varies.</w:t>
       </w:r>
     </w:p>
     <w:p>
@@ -765,7 +765,7 @@
           <w:i w:val="0"/>
           <w:sz w:val="19"/>
         </w:rPr>
-        <w:t>3.1.2. Two output configurations. — In the first, resembling the S25 harness, the schema is described in the prompt and the model is asked to comply in JSON mode; output is parsed afterward, with a single repair retry and a discard path on failure. This is a post-hoc constraint: nothing prevents malformed output, and when it occurs the extraction is lost. In the second, the schema is passed as a grammar (response_format: json_schema), so at each decoding step the sampler is restricted to tokens that can continue a schema-valid string (Willard &amp; Louf 2023). The model cannot emit an unparseable response; no repair or discard path is required. This is the configuration reported as “constrained” throughout.</w:t>
+        <w:t>3.1.2. Two output configurations. — In the first, resembling the Sha26 harness, the schema is described in the prompt and the model is asked to comply in JSON mode; output is parsed afterward, with a single repair retry and a discard path on failure. This is a post-hoc constraint: nothing prevents malformed output, and when it occurs the extraction is lost. In the second, the schema is passed as a grammar (response_format: json_schema), so at each decoding step the sampler is restricted to tokens that can continue a schema-valid string (Willard &amp; Louf 2023). The model cannot emit an unparseable response; no repair or discard path is required. This is the configuration reported as “constrained” throughout.</w:t>
       </w:r>
     </w:p>
     <w:p>
@@ -1066,7 +1066,7 @@
               <w:rPr>
                 <w:sz w:val="17"/>
               </w:rPr>
-              <w:t>Mistral-7B (S25)</w:t>
+              <w:t>Mistral-7B (Sha26)</w:t>
             </w:r>
           </w:p>
         </w:tc>
@@ -1132,7 +1132,7 @@
           <w:i w:val="0"/>
           <w:sz w:val="19"/>
         </w:rPr>
-        <w:t>We state the finding plainly: the reported weakness of open 7B models on this task is substantially an artifact of the extraction harness rather than of the model. The same weights that score 0.690 score 0.935 when the decoder is constrained — a gain of +0.245 F1 with no fine-tuning, no retrieval, and no larger model. This also reconciles an apparent tension with the 97.2% headline of S25: that figure is conditional on Circulars known to contain a redshift, after retrieval, whereas the F1 here is unconditioned over the released predictions; both are scored against the same denominator as those predictions.</w:t>
+        <w:t>We state the finding plainly: the reported weakness of open 7B models on this task is substantially an artifact of the extraction harness rather than of the model. The same weights that score 0.690 score 0.935 when the decoder is constrained — a gain of +0.245 F1 with no fine-tuning, no retrieval, and no larger model. This also reconciles an apparent tension with the 97.2% headline of Sha26: that figure is conditional on Circulars known to contain a redshift, after retrieval, whereas the F1 here is unconditioned over the released predictions; both are scored against the same denominator as those predictions.</w:t>
       </w:r>
     </w:p>
     <w:p>
@@ -1240,7 +1240,7 @@
           <w:i/>
           <w:sz w:val="17"/>
         </w:rPr>
-        <w:t>Per-field F1 for the regex baseline, the grammar-constrained Mistral-7B extractor, and the published Mistral-7B predictions of S25 (top), and ΔF1 against the published baseline (bottom). Hatched bars denote a non-extracting extractor or zero gold support.</w:t>
+        <w:t>Per-field F1 for the regex baseline, the grammar-constrained Mistral-7B extractor, and the published Mistral-7B predictions of Sha26 (top), and ΔF1 against the published baseline (bottom). Hatched bars denote a non-extracting extractor or zero gold support.</w:t>
       </w:r>
     </w:p>
     <w:p>
@@ -1365,7 +1365,7 @@
           <w:i w:val="0"/>
           <w:sz w:val="19"/>
         </w:rPr>
-        <w:t>Holding the model fixed and varying only the output channel isolates a result that we believe is favorable to the thesis of S25 rather than a correction to it: open 7B models are more capable at structured scientific extraction than free-form-generation numbers indicate, once the serialization bottleneck is removed. The +0.245 F1 recovered on redshift is obtained with the released weights, no fine-tuning, and no retrieval. Because the model is served locally, the marginal cost per Circular is zero and no text leaves the institution — removing both the recurring cost and the data-governance objection that would attach to a commercial API in a continuous observatory pipeline.</w:t>
+        <w:t>Holding the model fixed and varying only the output channel isolates a result that we believe is favorable to the thesis of Sha26 rather than a correction to it: open 7B models are more capable at structured scientific extraction than free-form-generation numbers indicate, once the serialization bottleneck is removed. The +0.245 F1 recovered on redshift is obtained with the released weights, no fine-tuning, and no retrieval. Because the model is served locally, the marginal cost per Circular is zero and no text leaves the institution — removing both the recurring cost and the data-governance objection that would attach to a commercial API in a continuous observatory pipeline.</w:t>
       </w:r>
     </w:p>
     <w:p>
@@ -1392,7 +1392,7 @@
           <w:i w:val="0"/>
           <w:sz w:val="19"/>
         </w:rPr>
-        <w:t>First, the redshift result is a lower bound on the constrained model’s advantage: the fields on which a language model should separate most sharply from regex — multi-row photometry tables, in-prose classification, unlabeled coordinates — are precisely those S25 did not extract, so no gold exists to score them. A hand-labeled set covering these fields is the natural next experiment. Second, constrained decoding must be engineered, not merely enabled: a naive schema-to-grammar conversion of a realistic Pydantic model does not work, and every unbounded degree of freedom becomes a way for a small model to exhaust its token budget (Appendix A). Third, telescope-name extraction remains weak for all extractors, reflecting a normalization gap between formal catalog codes and prose mentions rather than a failure of extraction as such.</w:t>
+        <w:t>First, the redshift result is a lower bound on the constrained model’s advantage: the fields on which a language model should separate most sharply from regex — multi-row photometry tables, in-prose classification, unlabeled coordinates — are precisely those Sha26 did not extract, so no gold exists to score them. A hand-labeled set covering these fields is the natural next experiment. Second, constrained decoding must be engineered, not merely enabled: a naive schema-to-grammar conversion of a realistic Pydantic model does not work, and every unbounded degree of freedom becomes a way for a small model to exhaust its token budget (Appendix A). Third, telescope-name extraction remains weak for all extractors, reflecting a normalization gap between formal catalog codes and prose mentions rather than a failure of extraction as such.</w:t>
       </w:r>
     </w:p>
     <w:p>
@@ -1419,7 +1419,7 @@
           <w:i w:val="0"/>
           <w:sz w:val="18"/>
         </w:rPr>
-        <w:t>We thank Sushant Sharma Chaudhary for deploying the Mistral-7B llama.cpp server used for the constrained-decoding experiments and for pointing us to grammar-constrained decoding through the server’s response_format interface, the mechanism on which the central result rests. The authors acknowledge the Minnesota Supercomputing Institute (MSI) at the University of Minnesota for providing the GPU resources that contributed to the results reported here. This work builds directly on S25 and uses their released Circulars archive, topic labels, and Swift-validated redshift table, together with the skyportal/timedomain-taxonomy controlled vocabulary. Portions of the SQLite/FTS indexer and the GCN poller were ported from the sjhend03/GCNMCP prototype with attribution.</w:t>
+        <w:t>We thank Sushant Sharma Chaudhary for deploying the Mistral-7B llama.cpp server used for the constrained-decoding experiments and for pointing us to grammar-constrained decoding through the server’s response_format interface, the mechanism on which the central result rests. The authors acknowledge the Minnesota Supercomputing Institute (MSI) at the University of Minnesota for providing the GPU resources that contributed to the results reported here. This work builds directly on Sha26 and uses their released Circulars archive, topic labels, and Swift-validated redshift table, together with the skyportal/timedomain-taxonomy controlled vocabulary. Portions of the SQLite/FTS indexer and the GCN poller were ported from the sjhend03/GCNMCP prototype with attribution.</w:t>
       </w:r>
     </w:p>
     <w:p>
@@ -1908,7 +1908,7 @@
         <w:footnoteRef/>
       </w:r>
       <w:r>
-        <w:t xml:space="preserve"> S25 code and data: https://github.com/nasa-gcn/circulars-nlp-paper</w:t>
+        <w:t xml:space="preserve"> Sha26 code and data: https://github.com/nasa-gcn/circulars-nlp-paper</w:t>
       </w:r>
     </w:p>
   </w:footnote>

</xml_diff>